<commit_message>
Yayın: elektrik birim fiyatı kitabın kendi kuruluşuna çevrildi
Metraj cetveli, keşif özetleri ve teklif cetvelleri ELEKTRİK-BF revizyon
koduyla işaretlendi: birim fiyat = malzeme rayici x 1,25 + pozun kendi
montaj bedeli (işçilik rayicinden kurulur, oran değildir).

Co-Authored-By: Claude Opus 5 <noreply@anthropic.com>
Claude-Session: https://claude.ai/code/session_01HJPp6bx7wepUX5p8fxGcjg
</commit_message>
<xml_diff>
--- a/belgeler/28_TEKLIF_SUNUM_FORMU_MARFEN.docx
+++ b/belgeler/28_TEKLIF_SUNUM_FORMU_MARFEN.docx
@@ -7625,7 +7625,7 @@
                 <w:sz w:val="14"/>
                 <w:szCs w:val="14"/>
               </w:rPr>
-              <w:t xml:space="preserve">9.209,41</w:t>
+              <w:t xml:space="preserve">10.082,96</w:t>
             </w:r>
           </w:p>
         </w:tc>
@@ -7659,7 +7659,7 @@
                 <w:sz w:val="14"/>
                 <w:szCs w:val="14"/>
               </w:rPr>
-              <w:t xml:space="preserve">9.209,41</w:t>
+              <w:t xml:space="preserve">10.082,96</w:t>
             </w:r>
           </w:p>
         </w:tc>
@@ -7877,7 +7877,7 @@
                 <w:sz w:val="14"/>
                 <w:szCs w:val="14"/>
               </w:rPr>
-              <w:t xml:space="preserve">4.586,47</w:t>
+              <w:t xml:space="preserve">4.435,25</w:t>
             </w:r>
           </w:p>
         </w:tc>
@@ -7911,7 +7911,7 @@
                 <w:sz w:val="14"/>
                 <w:szCs w:val="14"/>
               </w:rPr>
-              <w:t xml:space="preserve">4.586,47</w:t>
+              <w:t xml:space="preserve">4.435,25</w:t>
             </w:r>
           </w:p>
         </w:tc>
@@ -8129,7 +8129,7 @@
                 <w:sz w:val="14"/>
                 <w:szCs w:val="14"/>
               </w:rPr>
-              <w:t xml:space="preserve">1.402,96</w:t>
+              <w:t xml:space="preserve">1.436,20</w:t>
             </w:r>
           </w:p>
         </w:tc>
@@ -8163,7 +8163,7 @@
                 <w:sz w:val="14"/>
                 <w:szCs w:val="14"/>
               </w:rPr>
-              <w:t xml:space="preserve">2.805,92</w:t>
+              <w:t xml:space="preserve">2.872,40</w:t>
             </w:r>
           </w:p>
         </w:tc>
@@ -8381,7 +8381,7 @@
                 <w:sz w:val="14"/>
                 <w:szCs w:val="14"/>
               </w:rPr>
-              <w:t xml:space="preserve">260,01</w:t>
+              <w:t xml:space="preserve">244,02</w:t>
             </w:r>
           </w:p>
         </w:tc>
@@ -8415,7 +8415,7 @@
                 <w:sz w:val="14"/>
                 <w:szCs w:val="14"/>
               </w:rPr>
-              <w:t xml:space="preserve">78.003,00</w:t>
+              <w:t xml:space="preserve">73.206,00</w:t>
             </w:r>
           </w:p>
         </w:tc>
@@ -8633,7 +8633,7 @@
                 <w:sz w:val="14"/>
                 <w:szCs w:val="14"/>
               </w:rPr>
-              <w:t xml:space="preserve">2.594,89</w:t>
+              <w:t xml:space="preserve">2.222,88</w:t>
             </w:r>
           </w:p>
         </w:tc>
@@ -8667,7 +8667,7 @@
                 <w:sz w:val="14"/>
                 <w:szCs w:val="14"/>
               </w:rPr>
-              <w:t xml:space="preserve">77.846,70</w:t>
+              <w:t xml:space="preserve">66.686,40</w:t>
             </w:r>
           </w:p>
         </w:tc>
@@ -8885,7 +8885,7 @@
                 <w:sz w:val="14"/>
                 <w:szCs w:val="14"/>
               </w:rPr>
-              <w:t xml:space="preserve">1.782,25</w:t>
+              <w:t xml:space="preserve">1.552,40</w:t>
             </w:r>
           </w:p>
         </w:tc>
@@ -8919,7 +8919,7 @@
                 <w:sz w:val="14"/>
                 <w:szCs w:val="14"/>
               </w:rPr>
-              <w:t xml:space="preserve">3.564,50</w:t>
+              <w:t xml:space="preserve">3.104,80</w:t>
             </w:r>
           </w:p>
         </w:tc>
@@ -9137,7 +9137,7 @@
                 <w:sz w:val="14"/>
                 <w:szCs w:val="14"/>
               </w:rPr>
-              <w:t xml:space="preserve">37,77</w:t>
+              <w:t xml:space="preserve">74,42</w:t>
             </w:r>
           </w:p>
         </w:tc>
@@ -9171,7 +9171,7 @@
                 <w:sz w:val="14"/>
                 <w:szCs w:val="14"/>
               </w:rPr>
-              <w:t xml:space="preserve">18.885,00</w:t>
+              <w:t xml:space="preserve">37.210,00</w:t>
             </w:r>
           </w:p>
         </w:tc>
@@ -9389,7 +9389,7 @@
                 <w:sz w:val="14"/>
                 <w:szCs w:val="14"/>
               </w:rPr>
-              <w:t xml:space="preserve">25,35</w:t>
+              <w:t xml:space="preserve">33,10</w:t>
             </w:r>
           </w:p>
         </w:tc>
@@ -9423,7 +9423,7 @@
                 <w:sz w:val="14"/>
                 <w:szCs w:val="14"/>
               </w:rPr>
-              <w:t xml:space="preserve">50.700,00</w:t>
+              <w:t xml:space="preserve">66.200,00</w:t>
             </w:r>
           </w:p>
         </w:tc>
@@ -9641,7 +9641,7 @@
                 <w:sz w:val="14"/>
                 <w:szCs w:val="14"/>
               </w:rPr>
-              <w:t xml:space="preserve">15,88</w:t>
+              <w:t xml:space="preserve">23,56</w:t>
             </w:r>
           </w:p>
         </w:tc>
@@ -9675,7 +9675,7 @@
                 <w:sz w:val="14"/>
                 <w:szCs w:val="14"/>
               </w:rPr>
-              <w:t xml:space="preserve">9.528,00</w:t>
+              <w:t xml:space="preserve">14.136,00</w:t>
             </w:r>
           </w:p>
         </w:tc>
@@ -9893,7 +9893,7 @@
                 <w:sz w:val="14"/>
                 <w:szCs w:val="14"/>
               </w:rPr>
-              <w:t xml:space="preserve">204,16</w:t>
+              <w:t xml:space="preserve">188,13</w:t>
             </w:r>
           </w:p>
         </w:tc>
@@ -9927,7 +9927,7 @@
                 <w:sz w:val="14"/>
                 <w:szCs w:val="14"/>
               </w:rPr>
-              <w:t xml:space="preserve">20.416,00</w:t>
+              <w:t xml:space="preserve">18.813,00</w:t>
             </w:r>
           </w:p>
         </w:tc>
@@ -10145,7 +10145,7 @@
                 <w:sz w:val="14"/>
                 <w:szCs w:val="14"/>
               </w:rPr>
-              <w:t xml:space="preserve">150,75</w:t>
+              <w:t xml:space="preserve">156,11</w:t>
             </w:r>
           </w:p>
         </w:tc>
@@ -10179,7 +10179,7 @@
                 <w:sz w:val="14"/>
                 <w:szCs w:val="14"/>
               </w:rPr>
-              <w:t xml:space="preserve">28.039,50</w:t>
+              <w:t xml:space="preserve">29.036,46</w:t>
             </w:r>
           </w:p>
         </w:tc>
@@ -10397,7 +10397,7 @@
                 <w:sz w:val="14"/>
                 <w:szCs w:val="14"/>
               </w:rPr>
-              <w:t xml:space="preserve">20.274,29</w:t>
+              <w:t xml:space="preserve">17.410,01</w:t>
             </w:r>
           </w:p>
         </w:tc>
@@ -10431,7 +10431,7 @@
                 <w:sz w:val="14"/>
                 <w:szCs w:val="14"/>
               </w:rPr>
-              <w:t xml:space="preserve">20.274,29</w:t>
+              <w:t xml:space="preserve">17.410,01</w:t>
             </w:r>
           </w:p>
         </w:tc>
@@ -10649,7 +10649,7 @@
                 <w:sz w:val="14"/>
                 <w:szCs w:val="14"/>
               </w:rPr>
-              <w:t xml:space="preserve">554,74</w:t>
+              <w:t xml:space="preserve">481,15</w:t>
             </w:r>
           </w:p>
         </w:tc>
@@ -10683,7 +10683,7 @@
                 <w:sz w:val="14"/>
                 <w:szCs w:val="14"/>
               </w:rPr>
-              <w:t xml:space="preserve">8.875,84</w:t>
+              <w:t xml:space="preserve">7.698,40</w:t>
             </w:r>
           </w:p>
         </w:tc>
@@ -10901,7 +10901,7 @@
                 <w:sz w:val="14"/>
                 <w:szCs w:val="14"/>
               </w:rPr>
-              <w:t xml:space="preserve">607.554,07</w:t>
+              <w:t xml:space="preserve">484.082,09</w:t>
             </w:r>
           </w:p>
         </w:tc>
@@ -10935,7 +10935,7 @@
                 <w:sz w:val="14"/>
                 <w:szCs w:val="14"/>
               </w:rPr>
-              <w:t xml:space="preserve">607.554,07</w:t>
+              <w:t xml:space="preserve">484.082,09</w:t>
             </w:r>
           </w:p>
         </w:tc>
@@ -11153,7 +11153,7 @@
                 <w:sz w:val="14"/>
                 <w:szCs w:val="14"/>
               </w:rPr>
-              <w:t xml:space="preserve">103.549,61</w:t>
+              <w:t xml:space="preserve">83.282,35</w:t>
             </w:r>
           </w:p>
         </w:tc>
@@ -11187,7 +11187,7 @@
                 <w:sz w:val="14"/>
                 <w:szCs w:val="14"/>
               </w:rPr>
-              <w:t xml:space="preserve">103.549,61</w:t>
+              <w:t xml:space="preserve">83.282,35</w:t>
             </w:r>
           </w:p>
         </w:tc>
@@ -11405,7 +11405,7 @@
                 <w:sz w:val="14"/>
                 <w:szCs w:val="14"/>
               </w:rPr>
-              <w:t xml:space="preserve">50.107,49</w:t>
+              <w:t xml:space="preserve">44.709,81</w:t>
             </w:r>
           </w:p>
         </w:tc>
@@ -11439,7 +11439,7 @@
                 <w:sz w:val="14"/>
                 <w:szCs w:val="14"/>
               </w:rPr>
-              <w:t xml:space="preserve">50.107,49</w:t>
+              <w:t xml:space="preserve">44.709,81</w:t>
             </w:r>
           </w:p>
         </w:tc>
@@ -11721,7 +11721,7 @@
                 <w:sz w:val="14"/>
                 <w:szCs w:val="14"/>
               </w:rPr>
-              <w:t xml:space="preserve">9.608.468,24</w:t>
+              <w:t xml:space="preserve">9.477.488,37</w:t>
             </w:r>
           </w:p>
         </w:tc>
@@ -18394,7 +18394,7 @@
                 <w:sz w:val="14"/>
                 <w:szCs w:val="14"/>
               </w:rPr>
-              <w:t xml:space="preserve">9.209,41</w:t>
+              <w:t xml:space="preserve">10.082,96</w:t>
             </w:r>
           </w:p>
         </w:tc>
@@ -18428,7 +18428,7 @@
                 <w:sz w:val="14"/>
                 <w:szCs w:val="14"/>
               </w:rPr>
-              <w:t xml:space="preserve">9.209,41</w:t>
+              <w:t xml:space="preserve">10.082,96</w:t>
             </w:r>
           </w:p>
         </w:tc>
@@ -18646,7 +18646,7 @@
                 <w:sz w:val="14"/>
                 <w:szCs w:val="14"/>
               </w:rPr>
-              <w:t xml:space="preserve">4.586,47</w:t>
+              <w:t xml:space="preserve">4.435,25</w:t>
             </w:r>
           </w:p>
         </w:tc>
@@ -18680,7 +18680,7 @@
                 <w:sz w:val="14"/>
                 <w:szCs w:val="14"/>
               </w:rPr>
-              <w:t xml:space="preserve">4.586,47</w:t>
+              <w:t xml:space="preserve">4.435,25</w:t>
             </w:r>
           </w:p>
         </w:tc>
@@ -18898,7 +18898,7 @@
                 <w:sz w:val="14"/>
                 <w:szCs w:val="14"/>
               </w:rPr>
-              <w:t xml:space="preserve">1.402,96</w:t>
+              <w:t xml:space="preserve">1.436,20</w:t>
             </w:r>
           </w:p>
         </w:tc>
@@ -18932,7 +18932,7 @@
                 <w:sz w:val="14"/>
                 <w:szCs w:val="14"/>
               </w:rPr>
-              <w:t xml:space="preserve">2.805,92</w:t>
+              <w:t xml:space="preserve">2.872,40</w:t>
             </w:r>
           </w:p>
         </w:tc>
@@ -19150,7 +19150,7 @@
                 <w:sz w:val="14"/>
                 <w:szCs w:val="14"/>
               </w:rPr>
-              <w:t xml:space="preserve">260,01</w:t>
+              <w:t xml:space="preserve">244,02</w:t>
             </w:r>
           </w:p>
         </w:tc>
@@ -19184,7 +19184,7 @@
                 <w:sz w:val="14"/>
                 <w:szCs w:val="14"/>
               </w:rPr>
-              <w:t xml:space="preserve">78.003,00</w:t>
+              <w:t xml:space="preserve">73.206,00</w:t>
             </w:r>
           </w:p>
         </w:tc>
@@ -19402,7 +19402,7 @@
                 <w:sz w:val="14"/>
                 <w:szCs w:val="14"/>
               </w:rPr>
-              <w:t xml:space="preserve">2.594,89</w:t>
+              <w:t xml:space="preserve">2.222,88</w:t>
             </w:r>
           </w:p>
         </w:tc>
@@ -19436,7 +19436,7 @@
                 <w:sz w:val="14"/>
                 <w:szCs w:val="14"/>
               </w:rPr>
-              <w:t xml:space="preserve">77.846,70</w:t>
+              <w:t xml:space="preserve">66.686,40</w:t>
             </w:r>
           </w:p>
         </w:tc>
@@ -19654,7 +19654,7 @@
                 <w:sz w:val="14"/>
                 <w:szCs w:val="14"/>
               </w:rPr>
-              <w:t xml:space="preserve">1.782,25</w:t>
+              <w:t xml:space="preserve">1.552,40</w:t>
             </w:r>
           </w:p>
         </w:tc>
@@ -19688,7 +19688,7 @@
                 <w:sz w:val="14"/>
                 <w:szCs w:val="14"/>
               </w:rPr>
-              <w:t xml:space="preserve">3.564,50</w:t>
+              <w:t xml:space="preserve">3.104,80</w:t>
             </w:r>
           </w:p>
         </w:tc>
@@ -19906,7 +19906,7 @@
                 <w:sz w:val="14"/>
                 <w:szCs w:val="14"/>
               </w:rPr>
-              <w:t xml:space="preserve">37,77</w:t>
+              <w:t xml:space="preserve">74,42</w:t>
             </w:r>
           </w:p>
         </w:tc>
@@ -19940,7 +19940,7 @@
                 <w:sz w:val="14"/>
                 <w:szCs w:val="14"/>
               </w:rPr>
-              <w:t xml:space="preserve">18.885,00</w:t>
+              <w:t xml:space="preserve">37.210,00</w:t>
             </w:r>
           </w:p>
         </w:tc>
@@ -20158,7 +20158,7 @@
                 <w:sz w:val="14"/>
                 <w:szCs w:val="14"/>
               </w:rPr>
-              <w:t xml:space="preserve">25,35</w:t>
+              <w:t xml:space="preserve">33,10</w:t>
             </w:r>
           </w:p>
         </w:tc>
@@ -20192,7 +20192,7 @@
                 <w:sz w:val="14"/>
                 <w:szCs w:val="14"/>
               </w:rPr>
-              <w:t xml:space="preserve">50.700,00</w:t>
+              <w:t xml:space="preserve">66.200,00</w:t>
             </w:r>
           </w:p>
         </w:tc>
@@ -20410,7 +20410,7 @@
                 <w:sz w:val="14"/>
                 <w:szCs w:val="14"/>
               </w:rPr>
-              <w:t xml:space="preserve">15,88</w:t>
+              <w:t xml:space="preserve">23,56</w:t>
             </w:r>
           </w:p>
         </w:tc>
@@ -20444,7 +20444,7 @@
                 <w:sz w:val="14"/>
                 <w:szCs w:val="14"/>
               </w:rPr>
-              <w:t xml:space="preserve">9.528,00</w:t>
+              <w:t xml:space="preserve">14.136,00</w:t>
             </w:r>
           </w:p>
         </w:tc>
@@ -20662,7 +20662,7 @@
                 <w:sz w:val="14"/>
                 <w:szCs w:val="14"/>
               </w:rPr>
-              <w:t xml:space="preserve">204,16</w:t>
+              <w:t xml:space="preserve">188,13</w:t>
             </w:r>
           </w:p>
         </w:tc>
@@ -20696,7 +20696,7 @@
                 <w:sz w:val="14"/>
                 <w:szCs w:val="14"/>
               </w:rPr>
-              <w:t xml:space="preserve">20.416,00</w:t>
+              <w:t xml:space="preserve">18.813,00</w:t>
             </w:r>
           </w:p>
         </w:tc>
@@ -20914,7 +20914,7 @@
                 <w:sz w:val="14"/>
                 <w:szCs w:val="14"/>
               </w:rPr>
-              <w:t xml:space="preserve">150,75</w:t>
+              <w:t xml:space="preserve">156,11</w:t>
             </w:r>
           </w:p>
         </w:tc>
@@ -20948,7 +20948,7 @@
                 <w:sz w:val="14"/>
                 <w:szCs w:val="14"/>
               </w:rPr>
-              <w:t xml:space="preserve">28.039,50</w:t>
+              <w:t xml:space="preserve">29.036,46</w:t>
             </w:r>
           </w:p>
         </w:tc>
@@ -21166,7 +21166,7 @@
                 <w:sz w:val="14"/>
                 <w:szCs w:val="14"/>
               </w:rPr>
-              <w:t xml:space="preserve">20.274,29</w:t>
+              <w:t xml:space="preserve">17.410,01</w:t>
             </w:r>
           </w:p>
         </w:tc>
@@ -21200,7 +21200,7 @@
                 <w:sz w:val="14"/>
                 <w:szCs w:val="14"/>
               </w:rPr>
-              <w:t xml:space="preserve">20.274,29</w:t>
+              <w:t xml:space="preserve">17.410,01</w:t>
             </w:r>
           </w:p>
         </w:tc>
@@ -21418,7 +21418,7 @@
                 <w:sz w:val="14"/>
                 <w:szCs w:val="14"/>
               </w:rPr>
-              <w:t xml:space="preserve">554,74</w:t>
+              <w:t xml:space="preserve">481,15</w:t>
             </w:r>
           </w:p>
         </w:tc>
@@ -21452,7 +21452,7 @@
                 <w:sz w:val="14"/>
                 <w:szCs w:val="14"/>
               </w:rPr>
-              <w:t xml:space="preserve">8.875,84</w:t>
+              <w:t xml:space="preserve">7.698,40</w:t>
             </w:r>
           </w:p>
         </w:tc>
@@ -21670,7 +21670,7 @@
                 <w:sz w:val="14"/>
                 <w:szCs w:val="14"/>
               </w:rPr>
-              <w:t xml:space="preserve">607.554,07</w:t>
+              <w:t xml:space="preserve">484.082,09</w:t>
             </w:r>
           </w:p>
         </w:tc>
@@ -21704,7 +21704,7 @@
                 <w:sz w:val="14"/>
                 <w:szCs w:val="14"/>
               </w:rPr>
-              <w:t xml:space="preserve">607.554,07</w:t>
+              <w:t xml:space="preserve">484.082,09</w:t>
             </w:r>
           </w:p>
         </w:tc>
@@ -21922,7 +21922,7 @@
                 <w:sz w:val="14"/>
                 <w:szCs w:val="14"/>
               </w:rPr>
-              <w:t xml:space="preserve">103.549,61</w:t>
+              <w:t xml:space="preserve">83.282,35</w:t>
             </w:r>
           </w:p>
         </w:tc>
@@ -21956,7 +21956,7 @@
                 <w:sz w:val="14"/>
                 <w:szCs w:val="14"/>
               </w:rPr>
-              <w:t xml:space="preserve">103.549,61</w:t>
+              <w:t xml:space="preserve">83.282,35</w:t>
             </w:r>
           </w:p>
         </w:tc>
@@ -22174,7 +22174,7 @@
                 <w:sz w:val="14"/>
                 <w:szCs w:val="14"/>
               </w:rPr>
-              <w:t xml:space="preserve">50.107,49</w:t>
+              <w:t xml:space="preserve">44.709,81</w:t>
             </w:r>
           </w:p>
         </w:tc>
@@ -22208,7 +22208,7 @@
                 <w:sz w:val="14"/>
                 <w:szCs w:val="14"/>
               </w:rPr>
-              <w:t xml:space="preserve">50.107,49</w:t>
+              <w:t xml:space="preserve">44.709,81</w:t>
             </w:r>
           </w:p>
         </w:tc>
@@ -22490,7 +22490,7 @@
                 <w:sz w:val="14"/>
                 <w:szCs w:val="14"/>
               </w:rPr>
-              <w:t xml:space="preserve">9.608.467,72</w:t>
+              <w:t xml:space="preserve">9.477.487,85</w:t>
             </w:r>
           </w:p>
         </w:tc>
@@ -35147,7 +35147,7 @@
                 <w:sz w:val="14"/>
                 <w:szCs w:val="14"/>
               </w:rPr>
-              <w:t xml:space="preserve">41.083,03</w:t>
+              <w:t xml:space="preserve">41.783,13</w:t>
             </w:r>
           </w:p>
         </w:tc>
@@ -35181,7 +35181,7 @@
                 <w:sz w:val="14"/>
                 <w:szCs w:val="14"/>
               </w:rPr>
-              <w:t xml:space="preserve">41.083,03</w:t>
+              <w:t xml:space="preserve">41.783,13</w:t>
             </w:r>
           </w:p>
         </w:tc>
@@ -35399,7 +35399,7 @@
                 <w:sz w:val="14"/>
                 <w:szCs w:val="14"/>
               </w:rPr>
-              <w:t xml:space="preserve">10.633,02</w:t>
+              <w:t xml:space="preserve">11.631,65</w:t>
             </w:r>
           </w:p>
         </w:tc>
@@ -35433,7 +35433,7 @@
                 <w:sz w:val="14"/>
                 <w:szCs w:val="14"/>
               </w:rPr>
-              <w:t xml:space="preserve">10.633,02</w:t>
+              <w:t xml:space="preserve">11.631,65</w:t>
             </w:r>
           </w:p>
         </w:tc>
@@ -35651,7 +35651,7 @@
                 <w:sz w:val="14"/>
                 <w:szCs w:val="14"/>
               </w:rPr>
-              <w:t xml:space="preserve">1.955,40</w:t>
+              <w:t xml:space="preserve">2.218,15</w:t>
             </w:r>
           </w:p>
         </w:tc>
@@ -35685,7 +35685,7 @@
                 <w:sz w:val="14"/>
                 <w:szCs w:val="14"/>
               </w:rPr>
-              <w:t xml:space="preserve">1.955,40</w:t>
+              <w:t xml:space="preserve">2.218,15</w:t>
             </w:r>
           </w:p>
         </w:tc>
@@ -35903,7 +35903,7 @@
                 <w:sz w:val="14"/>
                 <w:szCs w:val="14"/>
               </w:rPr>
-              <w:t xml:space="preserve">6.179,11</w:t>
+              <w:t xml:space="preserve">5.920,76</w:t>
             </w:r>
           </w:p>
         </w:tc>
@@ -35937,7 +35937,7 @@
                 <w:sz w:val="14"/>
                 <w:szCs w:val="14"/>
               </w:rPr>
-              <w:t xml:space="preserve">6.179,11</w:t>
+              <w:t xml:space="preserve">5.920,76</w:t>
             </w:r>
           </w:p>
         </w:tc>
@@ -36155,7 +36155,7 @@
                 <w:sz w:val="14"/>
                 <w:szCs w:val="14"/>
               </w:rPr>
-              <w:t xml:space="preserve">1.402,96</w:t>
+              <w:t xml:space="preserve">1.436,20</w:t>
             </w:r>
           </w:p>
         </w:tc>
@@ -36189,7 +36189,7 @@
                 <w:sz w:val="14"/>
                 <w:szCs w:val="14"/>
               </w:rPr>
-              <w:t xml:space="preserve">2.805,92</w:t>
+              <w:t xml:space="preserve">2.872,40</w:t>
             </w:r>
           </w:p>
         </w:tc>
@@ -36407,7 +36407,7 @@
                 <w:sz w:val="14"/>
                 <w:szCs w:val="14"/>
               </w:rPr>
-              <w:t xml:space="preserve">360,29</w:t>
+              <w:t xml:space="preserve">332,17</w:t>
             </w:r>
           </w:p>
         </w:tc>
@@ -36441,7 +36441,7 @@
                 <w:sz w:val="14"/>
                 <w:szCs w:val="14"/>
               </w:rPr>
-              <w:t xml:space="preserve">18.014,50</w:t>
+              <w:t xml:space="preserve">16.608,50</w:t>
             </w:r>
           </w:p>
         </w:tc>
@@ -36659,7 +36659,7 @@
                 <w:sz w:val="14"/>
                 <w:szCs w:val="14"/>
               </w:rPr>
-              <w:t xml:space="preserve">66,63</w:t>
+              <w:t xml:space="preserve">71,32</w:t>
             </w:r>
           </w:p>
         </w:tc>
@@ -36693,7 +36693,7 @@
                 <w:sz w:val="14"/>
                 <w:szCs w:val="14"/>
               </w:rPr>
-              <w:t xml:space="preserve">3.331,50</w:t>
+              <w:t xml:space="preserve">3.566,00</w:t>
             </w:r>
           </w:p>
         </w:tc>
@@ -36911,7 +36911,7 @@
                 <w:sz w:val="14"/>
                 <w:szCs w:val="14"/>
               </w:rPr>
-              <w:t xml:space="preserve">8.097,86</w:t>
+              <w:t xml:space="preserve">7.783,12</w:t>
             </w:r>
           </w:p>
         </w:tc>
@@ -36945,7 +36945,7 @@
                 <w:sz w:val="14"/>
                 <w:szCs w:val="14"/>
               </w:rPr>
-              <w:t xml:space="preserve">32.391,44</w:t>
+              <w:t xml:space="preserve">31.132,48</w:t>
             </w:r>
           </w:p>
         </w:tc>
@@ -37163,7 +37163,7 @@
                 <w:sz w:val="14"/>
                 <w:szCs w:val="14"/>
               </w:rPr>
-              <w:t xml:space="preserve">9.922,59</w:t>
+              <w:t xml:space="preserve">8.313,16</w:t>
             </w:r>
           </w:p>
         </w:tc>
@@ -37197,7 +37197,7 @@
                 <w:sz w:val="14"/>
                 <w:szCs w:val="14"/>
               </w:rPr>
-              <w:t xml:space="preserve">39.690,36</w:t>
+              <w:t xml:space="preserve">33.252,64</w:t>
             </w:r>
           </w:p>
         </w:tc>
@@ -37479,7 +37479,7 @@
                 <w:sz w:val="14"/>
                 <w:szCs w:val="14"/>
               </w:rPr>
-              <w:t xml:space="preserve">563.523,04</w:t>
+              <w:t xml:space="preserve">556.424,47</w:t>
             </w:r>
           </w:p>
         </w:tc>
@@ -37573,7 +37573,7 @@
                 <w:sz w:val="14"/>
                 <w:szCs w:val="14"/>
               </w:rPr>
-              <w:t xml:space="preserve">21.343.456,14 TL</w:t>
+              <w:t xml:space="preserve">21.074.397,83 TL</w:t>
             </w:r>
           </w:p>
         </w:tc>

</xml_diff>

<commit_message>
Yayın: yüklenici künyesi ticaret sicili kaydına göre düzeltildi
Co-Authored-By: Claude Opus 5 <noreply@anthropic.com>
Claude-Session: https://claude.ai/code/session_01HJPp6bx7wepUX5p8fxGcjg
</commit_message>
<xml_diff>
--- a/belgeler/28_TEKLIF_SUNUM_FORMU_MARFEN.docx
+++ b/belgeler/28_TEKLIF_SUNUM_FORMU_MARFEN.docx
@@ -15,7 +15,7 @@
           <w:sz w:val="17"/>
           <w:szCs w:val="17"/>
         </w:rPr>
-        <w:t xml:space="preserve">MAHMUT TARI - MARFEN MÜHENDİSLİK TASARIM VE DANIŞMANLIK HİZMETLERİ</w:t>
+        <w:t xml:space="preserve">MAHMUT TARI MAFREN MÜHENDİSLİK DANIŞMANLIK HİZMETLERİ</w:t>
       </w:r>
     </w:p>
     <w:p>
@@ -145,7 +145,7 @@
                 <w:sz w:val="14"/>
                 <w:szCs w:val="14"/>
               </w:rPr>
-              <w:t xml:space="preserve">MAHMUT TARI - MARFEN MÜHENDİSLİK TASARIM VE DANIŞMANLIK HİZMETLERİ</w:t>
+              <w:t xml:space="preserve">MAHMUT TARI MAFREN MÜHENDİSLİK DANIŞMANLIK HİZMETLERİ</w:t>
             </w:r>
           </w:p>
         </w:tc>
@@ -494,7 +494,7 @@
                 <w:sz w:val="14"/>
                 <w:szCs w:val="14"/>
               </w:rPr>
-              <w:t xml:space="preserve"/>
+              <w:t xml:space="preserve">Gölcük/6196</w:t>
             </w:r>
           </w:p>
         </w:tc>
@@ -565,7 +565,7 @@
                 <w:sz w:val="14"/>
                 <w:szCs w:val="14"/>
               </w:rPr>
-              <w:t xml:space="preserve"/>
+              <w:t xml:space="preserve">0541 553 66 86</w:t>
             </w:r>
           </w:p>
         </w:tc>
@@ -634,7 +634,7 @@
                 <w:sz w:val="14"/>
                 <w:szCs w:val="14"/>
               </w:rPr>
-              <w:t xml:space="preserve"/>
+              <w:t xml:space="preserve">mahmuttari@gmail.com</w:t>
             </w:r>
           </w:p>
         </w:tc>

</xml_diff>

<commit_message>
Yayın: teklif geçerlilik tarihi 26.12.2027
Co-Authored-By: Claude Opus 5 <noreply@anthropic.com>
Claude-Session: https://claude.ai/code/session_01HJPp6bx7wepUX5p8fxGcjg
</commit_message>
<xml_diff>
--- a/belgeler/28_TEKLIF_SUNUM_FORMU_MARFEN.docx
+++ b/belgeler/28_TEKLIF_SUNUM_FORMU_MARFEN.docx
@@ -735,7 +735,7 @@
           <w:sz w:val="17"/>
           <w:szCs w:val="17"/>
         </w:rPr>
-        <w:t xml:space="preserve">15.12.2026</w:t>
+        <w:t xml:space="preserve">26.12.2027</w:t>
       </w:r>
       <w:r>
         <w:rPr>
@@ -37702,7 +37702,7 @@
           <w:sz w:val="17"/>
           <w:szCs w:val="17"/>
         </w:rPr>
-        <w:t xml:space="preserve">15.12.2026</w:t>
+        <w:t xml:space="preserve">26.12.2027</w:t>
       </w:r>
       <w:r>
         <w:rPr>

</xml_diff>

<commit_message>
Yayın: iki blok eşitlendi, belge sırası keşif özetine sabitlendi
Kümes A = Kümes B = 7.887.227,25 TL. Keşif özeti, teklif sunum formu,
teklifler ve iki Excel satır satır örtüşüyor.

Co-Authored-By: Claude Opus 5 <noreply@anthropic.com>
Claude-Session: https://claude.ai/code/session_01HJPp6bx7wepUX5p8fxGcjg
</commit_message>
<xml_diff>
--- a/belgeler/28_TEKLIF_SUNUM_FORMU_MARFEN.docx
+++ b/belgeler/28_TEKLIF_SUNUM_FORMU_MARFEN.docx
@@ -1471,7 +1471,7 @@
                 <w:sz w:val="14"/>
                 <w:szCs w:val="14"/>
               </w:rPr>
-              <w:t xml:space="preserve">1.684,390</w:t>
+              <w:t xml:space="preserve">1.684,385</w:t>
             </w:r>
           </w:p>
         </w:tc>
@@ -1539,7 +1539,7 @@
                 <w:sz w:val="14"/>
                 <w:szCs w:val="14"/>
               </w:rPr>
-              <w:t xml:space="preserve">88.211,50</w:t>
+              <w:t xml:space="preserve">88.211,24</w:t>
             </w:r>
           </w:p>
         </w:tc>
@@ -12712,7 +12712,7 @@
                 <w:sz w:val="14"/>
                 <w:szCs w:val="14"/>
               </w:rPr>
-              <w:t xml:space="preserve">7.887.227,51</w:t>
+              <w:t xml:space="preserve">7.887.227,25</w:t>
             </w:r>
           </w:p>
         </w:tc>
@@ -13248,7 +13248,7 @@
                 <w:sz w:val="14"/>
                 <w:szCs w:val="14"/>
               </w:rPr>
-              <w:t xml:space="preserve">1.684,380</w:t>
+              <w:t xml:space="preserve">1.684,385</w:t>
             </w:r>
           </w:p>
         </w:tc>
@@ -13316,7 +13316,7 @@
                 <w:sz w:val="14"/>
                 <w:szCs w:val="14"/>
               </w:rPr>
-              <w:t xml:space="preserve">88.210,98</w:t>
+              <w:t xml:space="preserve">88.211,24</w:t>
             </w:r>
           </w:p>
         </w:tc>
@@ -24489,7 +24489,7 @@
                 <w:sz w:val="14"/>
                 <w:szCs w:val="14"/>
               </w:rPr>
-              <w:t xml:space="preserve">7.887.226,99</w:t>
+              <w:t xml:space="preserve">7.887.227,25</w:t>
             </w:r>
           </w:p>
         </w:tc>

</xml_diff>